<commit_message>
fix(cr): ajout des réponses de sabiledine et arthur
</commit_message>
<xml_diff>
--- a/TP2_Flask_Kanban_GitHub.docx
+++ b/TP2_Flask_Kanban_GitHub.docx
@@ -231,7 +231,7 @@
           </mc:Choice>
           <mc:Fallback>
             <w:pict>
-              <v:group w14:anchorId="48AFD3EF" id="Group 45149" o:spid="_x0000_s1026" style="width:475.25pt;height:.5pt;mso-position-horizontal-relative:char;mso-position-vertical-relative:line" coordsize="60356,63" o:gfxdata="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">
+              <v:group w14:anchorId="2F1AF4EC" id="Group 45149" o:spid="_x0000_s1026" style="width:475.25pt;height:.5pt;mso-position-horizontal-relative:char;mso-position-vertical-relative:line" coordsize="60356,63" o:gfxdata="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">
                 <v:shape id="Shape 6195" o:spid="_x0000_s1027" style="position:absolute;width:60356;height:0;visibility:visible;mso-wrap-style:square;v-text-anchor:top" coordsize="6035675,0" o:gfxdata="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" path="m6035675,l,e" filled="f" strokecolor="#d5e8f0" strokeweight=".5pt">
                   <v:path arrowok="t" textboxrect="0,0,6035675,0"/>
                 </v:shape>
@@ -586,7 +586,7 @@
           </mc:Choice>
           <mc:Fallback>
             <w:pict>
-              <v:group w14:anchorId="36768DA6" id="Group 57263" o:spid="_x0000_s1026" style="width:475.25pt;height:.5pt;mso-position-horizontal-relative:char;mso-position-vertical-relative:line" coordsize="60356,63" o:gfxdata="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">
+              <v:group w14:anchorId="7B7FFB63" id="Group 57263" o:spid="_x0000_s1026" style="width:475.25pt;height:.5pt;mso-position-horizontal-relative:char;mso-position-vertical-relative:line" coordsize="60356,63" o:gfxdata="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">
                 <v:shape id="Shape 6684" o:spid="_x0000_s1027" style="position:absolute;width:60356;height:0;visibility:visible;mso-wrap-style:square;v-text-anchor:top" coordsize="6035675,0" o:gfxdata="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" path="m6035675,l,e" filled="f" strokecolor="#d5e8f0" strokeweight=".5pt">
                   <v:path arrowok="t" textboxrect="0,0,6035675,0"/>
                 </v:shape>
@@ -1151,7 +1151,7 @@
           </mc:Choice>
           <mc:Fallback>
             <w:pict>
-              <v:group w14:anchorId="4B57ED54" id="Group 57479" o:spid="_x0000_s1026" style="width:475.25pt;height:.5pt;mso-position-horizontal-relative:char;mso-position-vertical-relative:line" coordsize="60356,63" o:gfxdata="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">
+              <v:group w14:anchorId="55DB8111" id="Group 57479" o:spid="_x0000_s1026" style="width:475.25pt;height:.5pt;mso-position-horizontal-relative:char;mso-position-vertical-relative:line" coordsize="60356,63" o:gfxdata="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">
                 <v:shape id="Shape 7257" o:spid="_x0000_s1027" style="position:absolute;width:60356;height:0;visibility:visible;mso-wrap-style:square;v-text-anchor:top" coordsize="6035675,0" o:gfxdata="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" path="m6035675,l,e" filled="f" strokecolor="#d5e8f0" strokeweight=".5pt">
                   <v:path arrowok="t" textboxrect="0,0,6035675,0"/>
                 </v:shape>
@@ -1209,6 +1209,97 @@
     </w:p>
     <w:p>
       <w:pPr>
+        <w:pStyle w:val="Paragraphedeliste"/>
+        <w:ind w:left="705"/>
+        <w:rPr>
+          <w:rFonts w:cs="Times New Roman"/>
+          <w:color w:val="auto"/>
+          <w:lang w:val="fr-FR" w:bidi="ar-SA"/>
+        </w:rPr>
+      </w:pPr>
+      <w:r>
+        <w:rPr>
+          <w:lang w:val="fr-FR"/>
+        </w:rPr>
+        <w:t xml:space="preserve">Les identifiants sont placés </w:t>
+      </w:r>
+      <w:proofErr w:type="gramStart"/>
+      <w:r>
+        <w:rPr>
+          <w:lang w:val="fr-FR"/>
+        </w:rPr>
+        <w:t xml:space="preserve">dans </w:t>
+      </w:r>
+      <w:r>
+        <w:rPr>
+          <w:rStyle w:val="CodeHTML"/>
+          <w:rFonts w:eastAsia="Calibri"/>
+          <w:sz w:val="22"/>
+          <w:szCs w:val="22"/>
+          <w:lang w:val="fr-FR"/>
+        </w:rPr>
+        <w:t>.</w:t>
+      </w:r>
+      <w:proofErr w:type="spellStart"/>
+      <w:r>
+        <w:rPr>
+          <w:rStyle w:val="CodeHTML"/>
+          <w:rFonts w:ascii="Calibri" w:eastAsia="Calibri" w:hAnsi="Calibri" w:cs="Calibri"/>
+          <w:sz w:val="22"/>
+          <w:szCs w:val="22"/>
+          <w:lang w:val="fr-FR"/>
+        </w:rPr>
+        <w:t>env</w:t>
+      </w:r>
+      <w:proofErr w:type="spellEnd"/>
+      <w:proofErr w:type="gramEnd"/>
+      <w:r>
+        <w:rPr>
+          <w:lang w:val="fr-FR"/>
+        </w:rPr>
+        <w:t xml:space="preserve"> pour séparer la configuration du code et éviter d'exposer les mots de passe dans le dépôt Git. </w:t>
+      </w:r>
+      <w:proofErr w:type="gramStart"/>
+      <w:r>
+        <w:rPr>
+          <w:lang w:val="fr-FR"/>
+        </w:rPr>
+        <w:t>Le .</w:t>
+      </w:r>
+      <w:proofErr w:type="spellStart"/>
+      <w:r>
+        <w:rPr>
+          <w:lang w:val="fr-FR"/>
+        </w:rPr>
+        <w:t>env</w:t>
+      </w:r>
+      <w:proofErr w:type="spellEnd"/>
+      <w:proofErr w:type="gramEnd"/>
+      <w:r>
+        <w:rPr>
+          <w:lang w:val="fr-FR"/>
+        </w:rPr>
+        <w:t xml:space="preserve"> est ignoré grâce </w:t>
+      </w:r>
+      <w:proofErr w:type="gramStart"/>
+      <w:r>
+        <w:rPr>
+          <w:lang w:val="fr-FR"/>
+        </w:rPr>
+        <w:t>au .</w:t>
+      </w:r>
+      <w:proofErr w:type="spellStart"/>
+      <w:r>
+        <w:rPr>
+          <w:lang w:val="fr-FR"/>
+        </w:rPr>
+        <w:t>gitignore</w:t>
+      </w:r>
+      <w:proofErr w:type="spellEnd"/>
+      <w:proofErr w:type="gramEnd"/>
+    </w:p>
+    <w:p>
+      <w:pPr>
         <w:numPr>
           <w:ilvl w:val="0"/>
           <w:numId w:val="9"/>
@@ -1229,6 +1320,73 @@
     </w:p>
     <w:p>
       <w:pPr>
+        <w:pStyle w:val="Paragraphedeliste"/>
+        <w:ind w:left="705"/>
+        <w:rPr>
+          <w:rFonts w:cs="Times New Roman"/>
+          <w:color w:val="auto"/>
+          <w:lang w:val="fr-FR" w:bidi="ar-SA"/>
+        </w:rPr>
+      </w:pPr>
+      <w:r>
+        <w:rPr>
+          <w:lang w:val="fr-FR"/>
+        </w:rPr>
+        <w:t>Pour GET, les paramètres sont transmis dans l'URL (exemple : /</w:t>
+      </w:r>
+      <w:proofErr w:type="spellStart"/>
+      <w:r>
+        <w:rPr>
+          <w:lang w:val="fr-FR"/>
+        </w:rPr>
+        <w:t>db</w:t>
+      </w:r>
+      <w:proofErr w:type="spellEnd"/>
+      <w:r>
+        <w:rPr>
+          <w:lang w:val="fr-FR"/>
+        </w:rPr>
+        <w:t>/stats/</w:t>
+      </w:r>
+      <w:proofErr w:type="spellStart"/>
+      <w:proofErr w:type="gramStart"/>
+      <w:r>
+        <w:rPr>
+          <w:lang w:val="fr-FR"/>
+        </w:rPr>
+        <w:t>describe?</w:t>
+      </w:r>
+      <w:proofErr w:type="gramEnd"/>
+      <w:r>
+        <w:rPr>
+          <w:lang w:val="fr-FR"/>
+        </w:rPr>
+        <w:t>serie</w:t>
+      </w:r>
+      <w:proofErr w:type="spellEnd"/>
+      <w:r>
+        <w:rPr>
+          <w:lang w:val="fr-FR"/>
+        </w:rPr>
+        <w:t>=</w:t>
+      </w:r>
+      <w:proofErr w:type="spellStart"/>
+      <w:r>
+        <w:rPr>
+          <w:lang w:val="fr-FR"/>
+        </w:rPr>
+        <w:t>serie_A</w:t>
+      </w:r>
+      <w:proofErr w:type="spellEnd"/>
+      <w:r>
+        <w:rPr>
+          <w:lang w:val="fr-FR"/>
+        </w:rPr>
+        <w:t>). Pour POST, les données sont envoyées dans le corps de la requête au format JSON. Cette méthode est utilisée lorsqu'on envoie beaucoup de données ou des structures complexes.</w:t>
+      </w:r>
+    </w:p>
+    <w:p>
+      <w:pPr>
         <w:numPr>
           <w:ilvl w:val="0"/>
           <w:numId w:val="9"/>
@@ -1277,6 +1435,83 @@
     </w:p>
     <w:p>
       <w:pPr>
+        <w:spacing w:after="4" w:line="261" w:lineRule="auto"/>
+        <w:ind w:left="705" w:right="14"/>
+        <w:jc w:val="both"/>
+        <w:rPr>
+          <w:lang w:val="fr-FR"/>
+        </w:rPr>
+      </w:pPr>
+      <w:r>
+        <w:rPr>
+          <w:lang w:val="fr-FR"/>
+        </w:rPr>
+        <w:t xml:space="preserve">Avec </w:t>
+      </w:r>
+      <w:proofErr w:type="spellStart"/>
+      <w:r>
+        <w:rPr>
+          <w:lang w:val="fr-FR"/>
+        </w:rPr>
+        <w:t>curl</w:t>
+      </w:r>
+      <w:proofErr w:type="spellEnd"/>
+    </w:p>
+    <w:p>
+      <w:pPr>
+        <w:spacing w:after="4" w:line="261" w:lineRule="auto"/>
+        <w:ind w:left="705" w:right="14"/>
+        <w:jc w:val="both"/>
+        <w:rPr>
+          <w:lang w:val="fr-FR"/>
+        </w:rPr>
+      </w:pPr>
+      <w:r>
+        <w:rPr>
+          <w:noProof/>
+        </w:rPr>
+        <w:drawing>
+          <wp:inline distT="0" distB="0" distL="0" distR="0" wp14:anchorId="7335F00C" wp14:editId="7746FFB5">
+            <wp:extent cx="5760720" cy="610870"/>
+            <wp:effectExtent l="0" t="0" r="0" b="0"/>
+            <wp:docPr id="245624476" name="Image 1"/>
+            <wp:cNvGraphicFramePr/>
+            <a:graphic xmlns:a="http://schemas.openxmlformats.org/drawingml/2006/main">
+              <a:graphicData uri="http://schemas.openxmlformats.org/drawingml/2006/picture">
+                <pic:pic xmlns:pic="http://schemas.openxmlformats.org/drawingml/2006/picture">
+                  <pic:nvPicPr>
+                    <pic:cNvPr id="245624476" name="Image 1"/>
+                    <pic:cNvPicPr/>
+                  </pic:nvPicPr>
+                  <pic:blipFill>
+                    <a:blip r:embed="rId8"/>
+                    <a:stretch>
+                      <a:fillRect/>
+                    </a:stretch>
+                  </pic:blipFill>
+                  <pic:spPr>
+                    <a:xfrm>
+                      <a:off x="0" y="0"/>
+                      <a:ext cx="5760720" cy="610870"/>
+                    </a:xfrm>
+                    <a:prstGeom prst="rect">
+                      <a:avLst/>
+                    </a:prstGeom>
+                    <a:noFill/>
+                    <a:ln>
+                      <a:noFill/>
+                      <a:prstDash/>
+                    </a:ln>
+                  </pic:spPr>
+                </pic:pic>
+              </a:graphicData>
+            </a:graphic>
+          </wp:inline>
+        </w:drawing>
+      </w:r>
+    </w:p>
+    <w:p>
+      <w:pPr>
         <w:numPr>
           <w:ilvl w:val="0"/>
           <w:numId w:val="9"/>
@@ -1297,6 +1532,149 @@
     </w:p>
     <w:p>
       <w:pPr>
+        <w:pStyle w:val="Paragraphedeliste"/>
+        <w:ind w:left="705"/>
+        <w:rPr>
+          <w:rFonts w:cs="Times New Roman"/>
+          <w:color w:val="auto"/>
+          <w:lang w:val="fr-FR" w:bidi="ar-SA"/>
+        </w:rPr>
+      </w:pPr>
+      <w:r>
+        <w:rPr>
+          <w:lang w:val="fr-FR"/>
+        </w:rPr>
+        <w:t xml:space="preserve">Nous avons utilisé la même base de données MySQL (sur </w:t>
+      </w:r>
+      <w:proofErr w:type="spellStart"/>
+      <w:r>
+        <w:rPr>
+          <w:lang w:val="fr-FR"/>
+        </w:rPr>
+        <w:t>alwaysdata</w:t>
+      </w:r>
+      <w:proofErr w:type="spellEnd"/>
+      <w:r>
+        <w:rPr>
+          <w:lang w:val="fr-FR"/>
+        </w:rPr>
+        <w:t>) afin que le Service 4 puisse insérer les données CSV et que le Service 3 puisse les lire.</w:t>
+      </w:r>
+    </w:p>
+    <w:p>
+      <w:pPr>
+        <w:pStyle w:val="Paragraphedeliste"/>
+        <w:ind w:left="705"/>
+      </w:pPr>
+      <w:r>
+        <w:rPr>
+          <w:noProof/>
+        </w:rPr>
+        <w:drawing>
+          <wp:inline distT="0" distB="0" distL="0" distR="0" wp14:anchorId="441B7532" wp14:editId="7EEE969B">
+            <wp:extent cx="1637665" cy="2536190"/>
+            <wp:effectExtent l="0" t="0" r="635" b="0"/>
+            <wp:docPr id="245268256" name="Image 64"/>
+            <wp:cNvGraphicFramePr>
+              <a:graphicFrameLocks xmlns:a="http://schemas.openxmlformats.org/drawingml/2006/main" noChangeAspect="1"/>
+            </wp:cNvGraphicFramePr>
+            <a:graphic xmlns:a="http://schemas.openxmlformats.org/drawingml/2006/main">
+              <a:graphicData uri="http://schemas.openxmlformats.org/drawingml/2006/picture">
+                <pic:pic xmlns:pic="http://schemas.openxmlformats.org/drawingml/2006/picture">
+                  <pic:nvPicPr>
+                    <pic:cNvPr id="0" name="Image 3"/>
+                    <pic:cNvPicPr>
+                      <a:picLocks noChangeAspect="1" noChangeArrowheads="1"/>
+                    </pic:cNvPicPr>
+                  </pic:nvPicPr>
+                  <pic:blipFill>
+                    <a:blip r:embed="rId9">
+                      <a:extLst>
+                        <a:ext uri="{28A0092B-C50C-407E-A947-70E740481C1C}">
+                          <a14:useLocalDpi xmlns:a14="http://schemas.microsoft.com/office/drawing/2010/main" val="0"/>
+                        </a:ext>
+                      </a:extLst>
+                    </a:blip>
+                    <a:srcRect/>
+                    <a:stretch>
+                      <a:fillRect/>
+                    </a:stretch>
+                  </pic:blipFill>
+                  <pic:spPr bwMode="auto">
+                    <a:xfrm>
+                      <a:off x="0" y="0"/>
+                      <a:ext cx="1637665" cy="2536190"/>
+                    </a:xfrm>
+                    <a:prstGeom prst="rect">
+                      <a:avLst/>
+                    </a:prstGeom>
+                    <a:noFill/>
+                    <a:ln>
+                      <a:noFill/>
+                    </a:ln>
+                  </pic:spPr>
+                </pic:pic>
+              </a:graphicData>
+            </a:graphic>
+          </wp:inline>
+        </w:drawing>
+      </w:r>
+      <w:r>
+        <w:rPr>
+          <w:noProof/>
+        </w:rPr>
+        <w:drawing>
+          <wp:inline distT="0" distB="0" distL="0" distR="0" wp14:anchorId="6C6BC8E4" wp14:editId="43650640">
+            <wp:extent cx="2584450" cy="2409190"/>
+            <wp:effectExtent l="0" t="0" r="6350" b="0"/>
+            <wp:docPr id="1097044417" name="Image 63"/>
+            <wp:cNvGraphicFramePr>
+              <a:graphicFrameLocks xmlns:a="http://schemas.openxmlformats.org/drawingml/2006/main" noChangeAspect="1"/>
+            </wp:cNvGraphicFramePr>
+            <a:graphic xmlns:a="http://schemas.openxmlformats.org/drawingml/2006/main">
+              <a:graphicData uri="http://schemas.openxmlformats.org/drawingml/2006/picture">
+                <pic:pic xmlns:pic="http://schemas.openxmlformats.org/drawingml/2006/picture">
+                  <pic:nvPicPr>
+                    <pic:cNvPr id="0" name="Image 4"/>
+                    <pic:cNvPicPr>
+                      <a:picLocks noChangeAspect="1" noChangeArrowheads="1"/>
+                    </pic:cNvPicPr>
+                  </pic:nvPicPr>
+                  <pic:blipFill>
+                    <a:blip r:embed="rId10">
+                      <a:extLst>
+                        <a:ext uri="{28A0092B-C50C-407E-A947-70E740481C1C}">
+                          <a14:useLocalDpi xmlns:a14="http://schemas.microsoft.com/office/drawing/2010/main" val="0"/>
+                        </a:ext>
+                      </a:extLst>
+                    </a:blip>
+                    <a:srcRect/>
+                    <a:stretch>
+                      <a:fillRect/>
+                    </a:stretch>
+                  </pic:blipFill>
+                  <pic:spPr bwMode="auto">
+                    <a:xfrm>
+                      <a:off x="0" y="0"/>
+                      <a:ext cx="2584450" cy="2409190"/>
+                    </a:xfrm>
+                    <a:prstGeom prst="rect">
+                      <a:avLst/>
+                    </a:prstGeom>
+                    <a:noFill/>
+                    <a:ln>
+                      <a:noFill/>
+                    </a:ln>
+                  </pic:spPr>
+                </pic:pic>
+              </a:graphicData>
+            </a:graphic>
+          </wp:inline>
+        </w:drawing>
+      </w:r>
+    </w:p>
+    <w:p>
+      <w:pPr>
         <w:numPr>
           <w:ilvl w:val="0"/>
           <w:numId w:val="9"/>
@@ -1304,6 +1682,9 @@
         <w:spacing w:after="4" w:line="261" w:lineRule="auto"/>
         <w:ind w:right="14" w:hanging="360"/>
         <w:jc w:val="both"/>
+        <w:rPr>
+          <w:lang w:val="fr-FR"/>
+        </w:rPr>
       </w:pPr>
       <w:r>
         <w:rPr>
@@ -1376,24 +1757,73 @@
         <w:t xml:space="preserve">. </w:t>
       </w:r>
       <w:r>
-        <w:t xml:space="preserve">Quel est le </w:t>
-      </w:r>
-      <w:proofErr w:type="spellStart"/>
-      <w:proofErr w:type="gramStart"/>
-      <w:r>
-        <w:t>résultat</w:t>
-      </w:r>
-      <w:proofErr w:type="spellEnd"/>
-      <w:r>
-        <w:t xml:space="preserve"> ?</w:t>
-      </w:r>
-      <w:proofErr w:type="gramEnd"/>
+        <w:rPr>
+          <w:lang w:val="fr-FR"/>
+        </w:rPr>
+        <w:t>Quel est le résultat ?</w:t>
+      </w:r>
+    </w:p>
+    <w:p>
+      <w:pPr>
+        <w:spacing w:after="4" w:line="261" w:lineRule="auto"/>
+        <w:ind w:left="705" w:right="14"/>
+        <w:jc w:val="both"/>
+        <w:rPr>
+          <w:lang w:val="fr-FR"/>
+        </w:rPr>
+      </w:pPr>
+      <w:r>
+        <w:rPr>
+          <w:noProof/>
+        </w:rPr>
+        <w:drawing>
+          <wp:inline distT="0" distB="0" distL="0" distR="0" wp14:anchorId="7C3EF3AC" wp14:editId="16170346">
+            <wp:extent cx="5760720" cy="1852930"/>
+            <wp:effectExtent l="0" t="0" r="0" b="0"/>
+            <wp:docPr id="1908086177" name="Image 5"/>
+            <wp:cNvGraphicFramePr/>
+            <a:graphic xmlns:a="http://schemas.openxmlformats.org/drawingml/2006/main">
+              <a:graphicData uri="http://schemas.openxmlformats.org/drawingml/2006/picture">
+                <pic:pic xmlns:pic="http://schemas.openxmlformats.org/drawingml/2006/picture">
+                  <pic:nvPicPr>
+                    <pic:cNvPr id="1908086177" name="Image 5"/>
+                    <pic:cNvPicPr/>
+                  </pic:nvPicPr>
+                  <pic:blipFill>
+                    <a:blip r:embed="rId11"/>
+                    <a:stretch>
+                      <a:fillRect/>
+                    </a:stretch>
+                  </pic:blipFill>
+                  <pic:spPr>
+                    <a:xfrm>
+                      <a:off x="0" y="0"/>
+                      <a:ext cx="5760720" cy="1852930"/>
+                    </a:xfrm>
+                    <a:prstGeom prst="rect">
+                      <a:avLst/>
+                    </a:prstGeom>
+                    <a:noFill/>
+                    <a:ln>
+                      <a:noFill/>
+                      <a:prstDash/>
+                    </a:ln>
+                  </pic:spPr>
+                </pic:pic>
+              </a:graphicData>
+            </a:graphic>
+          </wp:inline>
+        </w:drawing>
+      </w:r>
     </w:p>
     <w:p>
       <w:pPr>
         <w:spacing w:after="4" w:line="261" w:lineRule="auto"/>
         <w:ind w:right="14"/>
         <w:jc w:val="both"/>
+        <w:rPr>
+          <w:lang w:val="fr-FR"/>
+        </w:rPr>
       </w:pPr>
     </w:p>
     <w:p>
@@ -1401,13 +1831,9 @@
         <w:spacing w:after="4" w:line="261" w:lineRule="auto"/>
         <w:ind w:right="14"/>
         <w:jc w:val="both"/>
-      </w:pPr>
-    </w:p>
-    <w:p>
-      <w:pPr>
-        <w:spacing w:after="4" w:line="261" w:lineRule="auto"/>
-        <w:ind w:right="14"/>
-        <w:jc w:val="both"/>
+        <w:rPr>
+          <w:lang w:val="fr-FR"/>
+        </w:rPr>
       </w:pPr>
     </w:p>
     <w:p>
@@ -1557,7 +1983,7 @@
           </mc:Choice>
           <mc:Fallback>
             <w:pict>
-              <v:group w14:anchorId="1F73410F" id="Group 56815" o:spid="_x0000_s1026" style="width:475.25pt;height:.5pt;mso-position-horizontal-relative:char;mso-position-vertical-relative:line" coordsize="60356,63" o:gfxdata="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">
+              <v:group w14:anchorId="4411BD5D" id="Group 56815" o:spid="_x0000_s1026" style="width:475.25pt;height:.5pt;mso-position-horizontal-relative:char;mso-position-vertical-relative:line" coordsize="60356,63" o:gfxdata="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">
                 <v:shape id="Shape 8000" o:spid="_x0000_s1027" style="position:absolute;width:60356;height:0;visibility:visible;mso-wrap-style:square;v-text-anchor:top" coordsize="6035675,0" o:gfxdata="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" path="m6035675,l,e" filled="f" strokecolor="#d5e8f0" strokeweight=".5pt">
                   <v:path arrowok="t" textboxrect="0,0,6035675,0"/>
                 </v:shape>
@@ -1593,6 +2019,22 @@
     </w:p>
     <w:p>
       <w:pPr>
+        <w:spacing w:after="4" w:line="261" w:lineRule="auto"/>
+        <w:ind w:left="705" w:right="14"/>
+        <w:jc w:val="both"/>
+        <w:rPr>
+          <w:lang w:val="fr-FR"/>
+        </w:rPr>
+      </w:pPr>
+      <w:r>
+        <w:rPr>
+          <w:lang w:val="fr-FR"/>
+        </w:rPr>
+        <w:t>Vérifier si elles sont déjà présentes si le fichier est bien un csv et si les données sont du bon type.</w:t>
+      </w:r>
+    </w:p>
+    <w:p>
+      <w:pPr>
         <w:numPr>
           <w:ilvl w:val="0"/>
           <w:numId w:val="10"/>
@@ -1613,6 +2055,50 @@
     </w:p>
     <w:p>
       <w:pPr>
+        <w:spacing w:after="4"/>
+        <w:ind w:left="705" w:right="14"/>
+        <w:jc w:val="both"/>
+        <w:rPr>
+          <w:lang w:val="fr-FR"/>
+        </w:rPr>
+      </w:pPr>
+      <w:r>
+        <w:rPr>
+          <w:lang w:val="fr-FR"/>
+        </w:rPr>
+        <w:t xml:space="preserve">On les </w:t>
+      </w:r>
+      <w:proofErr w:type="gramStart"/>
+      <w:r>
+        <w:rPr>
+          <w:lang w:val="fr-FR"/>
+        </w:rPr>
+        <w:t>remplaces</w:t>
+      </w:r>
+      <w:proofErr w:type="gramEnd"/>
+      <w:r>
+        <w:rPr>
+          <w:lang w:val="fr-FR"/>
+        </w:rPr>
+        <w:t xml:space="preserve"> par NaN et on supprime </w:t>
+      </w:r>
+      <w:proofErr w:type="gramStart"/>
+      <w:r>
+        <w:rPr>
+          <w:lang w:val="fr-FR"/>
+        </w:rPr>
+        <w:t>leur ligne</w:t>
+      </w:r>
+      <w:r>
+        <w:rPr>
+          <w:lang w:val="fr-FR"/>
+        </w:rPr>
+        <w:t>s</w:t>
+      </w:r>
+      <w:proofErr w:type="gramEnd"/>
+    </w:p>
+    <w:p>
+      <w:pPr>
         <w:numPr>
           <w:ilvl w:val="0"/>
           <w:numId w:val="10"/>
@@ -1633,6 +2119,52 @@
     </w:p>
     <w:p>
       <w:pPr>
+        <w:spacing w:after="4"/>
+        <w:ind w:left="705" w:right="14"/>
+        <w:jc w:val="both"/>
+        <w:rPr>
+          <w:lang w:val="fr-FR"/>
+        </w:rPr>
+      </w:pPr>
+      <w:r>
+        <w:rPr>
+          <w:lang w:val="fr-FR"/>
+        </w:rPr>
+        <w:t xml:space="preserve">On a </w:t>
+      </w:r>
+      <w:proofErr w:type="spellStart"/>
+      <w:proofErr w:type="gramStart"/>
+      <w:r>
+        <w:rPr>
+          <w:lang w:val="fr-FR"/>
+        </w:rPr>
+        <w:t>partager</w:t>
+      </w:r>
+      <w:proofErr w:type="spellEnd"/>
+      <w:proofErr w:type="gramEnd"/>
+      <w:r>
+        <w:rPr>
+          <w:lang w:val="fr-FR"/>
+        </w:rPr>
+        <w:t xml:space="preserve"> les données avec une base de données </w:t>
+      </w:r>
+      <w:proofErr w:type="spellStart"/>
+      <w:r>
+        <w:rPr>
+          <w:lang w:val="fr-FR"/>
+        </w:rPr>
+        <w:t>always</w:t>
+      </w:r>
+      <w:proofErr w:type="spellEnd"/>
+      <w:r>
+        <w:rPr>
+          <w:lang w:val="fr-FR"/>
+        </w:rPr>
+        <w:t xml:space="preserve"> data.</w:t>
+      </w:r>
+    </w:p>
+    <w:p>
+      <w:pPr>
         <w:numPr>
           <w:ilvl w:val="0"/>
           <w:numId w:val="10"/>
@@ -1640,6 +2172,9 @@
         <w:spacing w:after="4" w:line="261" w:lineRule="auto"/>
         <w:ind w:right="14" w:hanging="360"/>
         <w:jc w:val="both"/>
+        <w:rPr>
+          <w:lang w:val="fr-FR"/>
+        </w:rPr>
       </w:pPr>
       <w:r>
         <w:rPr>
@@ -1648,29 +2183,27 @@
         <w:t xml:space="preserve">Q4. Testez l'envoi d'un CSV avec une colonne « valeur » manquante. </w:t>
       </w:r>
       <w:r>
-        <w:t xml:space="preserve">Quelle </w:t>
-      </w:r>
-      <w:proofErr w:type="spellStart"/>
-      <w:r>
-        <w:t>réponse</w:t>
-      </w:r>
-      <w:proofErr w:type="spellEnd"/>
-      <w:r>
-        <w:t xml:space="preserve"> </w:t>
-      </w:r>
-      <w:proofErr w:type="spellStart"/>
-      <w:r>
-        <w:t>obtenez</w:t>
-      </w:r>
-      <w:proofErr w:type="spellEnd"/>
-      <w:r>
-        <w:t>-</w:t>
-      </w:r>
-      <w:proofErr w:type="gramStart"/>
-      <w:r>
-        <w:t>vous ?</w:t>
-      </w:r>
-      <w:proofErr w:type="gramEnd"/>
+        <w:rPr>
+          <w:lang w:val="fr-FR"/>
+        </w:rPr>
+        <w:t>Quelle réponse obtenez-vous ?</w:t>
+      </w:r>
+    </w:p>
+    <w:p>
+      <w:pPr>
+        <w:spacing w:after="4"/>
+        <w:ind w:left="705" w:right="14"/>
+        <w:jc w:val="both"/>
+        <w:rPr>
+          <w:lang w:val="fr-FR"/>
+        </w:rPr>
+      </w:pPr>
+      <w:r>
+        <w:rPr>
+          <w:lang w:val="fr-FR"/>
+        </w:rPr>
+        <w:t>Ça renvoie une erreur avec colonne obligatoire manquante</w:t>
+      </w:r>
     </w:p>
     <w:p>
       <w:pPr>
@@ -1708,6 +2241,946 @@
     </w:p>
     <w:p>
       <w:pPr>
+        <w:pStyle w:val="Paragraphedeliste"/>
+        <w:numPr>
+          <w:ilvl w:val="0"/>
+          <w:numId w:val="10"/>
+        </w:numPr>
+        <w:tabs>
+          <w:tab w:val="left" w:pos="916"/>
+          <w:tab w:val="left" w:pos="1832"/>
+          <w:tab w:val="left" w:pos="2748"/>
+          <w:tab w:val="left" w:pos="3664"/>
+          <w:tab w:val="left" w:pos="4580"/>
+          <w:tab w:val="left" w:pos="5496"/>
+          <w:tab w:val="left" w:pos="6412"/>
+          <w:tab w:val="left" w:pos="7328"/>
+          <w:tab w:val="left" w:pos="8244"/>
+          <w:tab w:val="left" w:pos="9160"/>
+          <w:tab w:val="left" w:pos="10076"/>
+          <w:tab w:val="left" w:pos="10992"/>
+          <w:tab w:val="left" w:pos="11908"/>
+          <w:tab w:val="left" w:pos="12824"/>
+          <w:tab w:val="left" w:pos="13740"/>
+          <w:tab w:val="left" w:pos="14656"/>
+        </w:tabs>
+        <w:spacing w:after="0" w:line="240" w:lineRule="auto"/>
+        <w:rPr>
+          <w:rFonts w:ascii="Courier New" w:eastAsia="Times New Roman" w:hAnsi="Courier New" w:cs="Courier New"/>
+          <w:color w:val="auto"/>
+          <w:kern w:val="0"/>
+          <w:sz w:val="20"/>
+          <w:szCs w:val="20"/>
+          <w:lang w:val="fr-FR" w:eastAsia="ja-JP" w:bidi="ar-SA"/>
+          <w14:ligatures w14:val="none"/>
+        </w:rPr>
+      </w:pPr>
+      <w:r>
+        <w:rPr>
+          <w:rFonts w:ascii="Courier New" w:eastAsia="Times New Roman" w:hAnsi="Courier New" w:cs="Courier New"/>
+          <w:color w:val="auto"/>
+          <w:kern w:val="0"/>
+          <w:sz w:val="20"/>
+          <w:szCs w:val="20"/>
+          <w:lang w:val="fr-FR" w:eastAsia="ja-JP" w:bidi="ar-SA"/>
+          <w14:ligatures w14:val="none"/>
+        </w:rPr>
+        <w:t>{</w:t>
+      </w:r>
+    </w:p>
+    <w:p>
+      <w:pPr>
+        <w:pStyle w:val="Paragraphedeliste"/>
+        <w:numPr>
+          <w:ilvl w:val="0"/>
+          <w:numId w:val="10"/>
+        </w:numPr>
+        <w:tabs>
+          <w:tab w:val="left" w:pos="916"/>
+          <w:tab w:val="left" w:pos="1832"/>
+          <w:tab w:val="left" w:pos="2748"/>
+          <w:tab w:val="left" w:pos="3664"/>
+          <w:tab w:val="left" w:pos="4580"/>
+          <w:tab w:val="left" w:pos="5496"/>
+          <w:tab w:val="left" w:pos="6412"/>
+          <w:tab w:val="left" w:pos="7328"/>
+          <w:tab w:val="left" w:pos="8244"/>
+          <w:tab w:val="left" w:pos="9160"/>
+          <w:tab w:val="left" w:pos="10076"/>
+          <w:tab w:val="left" w:pos="10992"/>
+          <w:tab w:val="left" w:pos="11908"/>
+          <w:tab w:val="left" w:pos="12824"/>
+          <w:tab w:val="left" w:pos="13740"/>
+          <w:tab w:val="left" w:pos="14656"/>
+        </w:tabs>
+        <w:spacing w:after="0" w:line="240" w:lineRule="auto"/>
+        <w:rPr>
+          <w:rFonts w:ascii="Courier New" w:eastAsia="Times New Roman" w:hAnsi="Courier New" w:cs="Courier New"/>
+          <w:color w:val="auto"/>
+          <w:kern w:val="0"/>
+          <w:sz w:val="20"/>
+          <w:szCs w:val="20"/>
+          <w:lang w:val="fr-FR" w:eastAsia="ja-JP" w:bidi="ar-SA"/>
+          <w14:ligatures w14:val="none"/>
+        </w:rPr>
+      </w:pPr>
+      <w:r>
+        <w:rPr>
+          <w:rFonts w:ascii="Courier New" w:eastAsia="Times New Roman" w:hAnsi="Courier New" w:cs="Courier New"/>
+          <w:color w:val="auto"/>
+          <w:kern w:val="0"/>
+          <w:sz w:val="20"/>
+          <w:szCs w:val="20"/>
+          <w:lang w:val="fr-FR" w:eastAsia="ja-JP" w:bidi="ar-SA"/>
+          <w14:ligatures w14:val="none"/>
+        </w:rPr>
+        <w:t xml:space="preserve">  "</w:t>
+      </w:r>
+      <w:proofErr w:type="spellStart"/>
+      <w:r>
+        <w:rPr>
+          <w:rFonts w:ascii="Courier New" w:eastAsia="Times New Roman" w:hAnsi="Courier New" w:cs="Courier New"/>
+          <w:color w:val="auto"/>
+          <w:kern w:val="0"/>
+          <w:sz w:val="20"/>
+          <w:szCs w:val="20"/>
+          <w:lang w:val="fr-FR" w:eastAsia="ja-JP" w:bidi="ar-SA"/>
+          <w14:ligatures w14:val="none"/>
+        </w:rPr>
+        <w:t>resultat</w:t>
+      </w:r>
+      <w:proofErr w:type="spellEnd"/>
+      <w:proofErr w:type="gramStart"/>
+      <w:r>
+        <w:rPr>
+          <w:rFonts w:ascii="Courier New" w:eastAsia="Times New Roman" w:hAnsi="Courier New" w:cs="Courier New"/>
+          <w:color w:val="auto"/>
+          <w:kern w:val="0"/>
+          <w:sz w:val="20"/>
+          <w:szCs w:val="20"/>
+          <w:lang w:val="fr-FR" w:eastAsia="ja-JP" w:bidi="ar-SA"/>
+          <w14:ligatures w14:val="none"/>
+        </w:rPr>
+        <w:t>":</w:t>
+      </w:r>
+      <w:proofErr w:type="gramEnd"/>
+      <w:r>
+        <w:rPr>
+          <w:rFonts w:ascii="Courier New" w:eastAsia="Times New Roman" w:hAnsi="Courier New" w:cs="Courier New"/>
+          <w:color w:val="auto"/>
+          <w:kern w:val="0"/>
+          <w:sz w:val="20"/>
+          <w:szCs w:val="20"/>
+          <w:lang w:val="fr-FR" w:eastAsia="ja-JP" w:bidi="ar-SA"/>
+          <w14:ligatures w14:val="none"/>
+        </w:rPr>
+        <w:t xml:space="preserve"> {</w:t>
+      </w:r>
+    </w:p>
+    <w:p>
+      <w:pPr>
+        <w:pStyle w:val="Paragraphedeliste"/>
+        <w:numPr>
+          <w:ilvl w:val="0"/>
+          <w:numId w:val="10"/>
+        </w:numPr>
+        <w:tabs>
+          <w:tab w:val="left" w:pos="916"/>
+          <w:tab w:val="left" w:pos="1832"/>
+          <w:tab w:val="left" w:pos="2748"/>
+          <w:tab w:val="left" w:pos="3664"/>
+          <w:tab w:val="left" w:pos="4580"/>
+          <w:tab w:val="left" w:pos="5496"/>
+          <w:tab w:val="left" w:pos="6412"/>
+          <w:tab w:val="left" w:pos="7328"/>
+          <w:tab w:val="left" w:pos="8244"/>
+          <w:tab w:val="left" w:pos="9160"/>
+          <w:tab w:val="left" w:pos="10076"/>
+          <w:tab w:val="left" w:pos="10992"/>
+          <w:tab w:val="left" w:pos="11908"/>
+          <w:tab w:val="left" w:pos="12824"/>
+          <w:tab w:val="left" w:pos="13740"/>
+          <w:tab w:val="left" w:pos="14656"/>
+        </w:tabs>
+        <w:spacing w:after="0" w:line="240" w:lineRule="auto"/>
+        <w:rPr>
+          <w:rFonts w:ascii="Courier New" w:eastAsia="Times New Roman" w:hAnsi="Courier New" w:cs="Courier New"/>
+          <w:color w:val="auto"/>
+          <w:kern w:val="0"/>
+          <w:sz w:val="20"/>
+          <w:szCs w:val="20"/>
+          <w:lang w:val="fr-FR" w:eastAsia="ja-JP" w:bidi="ar-SA"/>
+          <w14:ligatures w14:val="none"/>
+        </w:rPr>
+      </w:pPr>
+      <w:r>
+        <w:rPr>
+          <w:rFonts w:ascii="Courier New" w:eastAsia="Times New Roman" w:hAnsi="Courier New" w:cs="Courier New"/>
+          <w:color w:val="auto"/>
+          <w:kern w:val="0"/>
+          <w:sz w:val="20"/>
+          <w:szCs w:val="20"/>
+          <w:lang w:val="fr-FR" w:eastAsia="ja-JP" w:bidi="ar-SA"/>
+          <w14:ligatures w14:val="none"/>
+        </w:rPr>
+        <w:t xml:space="preserve">    "</w:t>
+      </w:r>
+      <w:proofErr w:type="spellStart"/>
+      <w:r>
+        <w:rPr>
+          <w:rFonts w:ascii="Courier New" w:eastAsia="Times New Roman" w:hAnsi="Courier New" w:cs="Courier New"/>
+          <w:color w:val="auto"/>
+          <w:kern w:val="0"/>
+          <w:sz w:val="20"/>
+          <w:szCs w:val="20"/>
+          <w:lang w:val="fr-FR" w:eastAsia="ja-JP" w:bidi="ar-SA"/>
+          <w14:ligatures w14:val="none"/>
+        </w:rPr>
+        <w:t>ecart_type</w:t>
+      </w:r>
+      <w:proofErr w:type="spellEnd"/>
+      <w:proofErr w:type="gramStart"/>
+      <w:r>
+        <w:rPr>
+          <w:rFonts w:ascii="Courier New" w:eastAsia="Times New Roman" w:hAnsi="Courier New" w:cs="Courier New"/>
+          <w:color w:val="auto"/>
+          <w:kern w:val="0"/>
+          <w:sz w:val="20"/>
+          <w:szCs w:val="20"/>
+          <w:lang w:val="fr-FR" w:eastAsia="ja-JP" w:bidi="ar-SA"/>
+          <w14:ligatures w14:val="none"/>
+        </w:rPr>
+        <w:t>":</w:t>
+      </w:r>
+      <w:proofErr w:type="gramEnd"/>
+      <w:r>
+        <w:rPr>
+          <w:rFonts w:ascii="Courier New" w:eastAsia="Times New Roman" w:hAnsi="Courier New" w:cs="Courier New"/>
+          <w:color w:val="auto"/>
+          <w:kern w:val="0"/>
+          <w:sz w:val="20"/>
+          <w:szCs w:val="20"/>
+          <w:lang w:val="fr-FR" w:eastAsia="ja-JP" w:bidi="ar-SA"/>
+          <w14:ligatures w14:val="none"/>
+        </w:rPr>
+        <w:t xml:space="preserve"> 15.9907,</w:t>
+      </w:r>
+    </w:p>
+    <w:p>
+      <w:pPr>
+        <w:pStyle w:val="Paragraphedeliste"/>
+        <w:numPr>
+          <w:ilvl w:val="0"/>
+          <w:numId w:val="10"/>
+        </w:numPr>
+        <w:tabs>
+          <w:tab w:val="left" w:pos="916"/>
+          <w:tab w:val="left" w:pos="1832"/>
+          <w:tab w:val="left" w:pos="2748"/>
+          <w:tab w:val="left" w:pos="3664"/>
+          <w:tab w:val="left" w:pos="4580"/>
+          <w:tab w:val="left" w:pos="5496"/>
+          <w:tab w:val="left" w:pos="6412"/>
+          <w:tab w:val="left" w:pos="7328"/>
+          <w:tab w:val="left" w:pos="8244"/>
+          <w:tab w:val="left" w:pos="9160"/>
+          <w:tab w:val="left" w:pos="10076"/>
+          <w:tab w:val="left" w:pos="10992"/>
+          <w:tab w:val="left" w:pos="11908"/>
+          <w:tab w:val="left" w:pos="12824"/>
+          <w:tab w:val="left" w:pos="13740"/>
+          <w:tab w:val="left" w:pos="14656"/>
+        </w:tabs>
+        <w:spacing w:after="0" w:line="240" w:lineRule="auto"/>
+        <w:rPr>
+          <w:rFonts w:ascii="Courier New" w:eastAsia="Times New Roman" w:hAnsi="Courier New" w:cs="Courier New"/>
+          <w:color w:val="auto"/>
+          <w:kern w:val="0"/>
+          <w:sz w:val="20"/>
+          <w:szCs w:val="20"/>
+          <w:lang w:val="fr-FR" w:eastAsia="ja-JP" w:bidi="ar-SA"/>
+          <w14:ligatures w14:val="none"/>
+        </w:rPr>
+      </w:pPr>
+      <w:r>
+        <w:rPr>
+          <w:rFonts w:ascii="Courier New" w:eastAsia="Times New Roman" w:hAnsi="Courier New" w:cs="Courier New"/>
+          <w:color w:val="auto"/>
+          <w:kern w:val="0"/>
+          <w:sz w:val="20"/>
+          <w:szCs w:val="20"/>
+          <w:lang w:val="fr-FR" w:eastAsia="ja-JP" w:bidi="ar-SA"/>
+          <w14:ligatures w14:val="none"/>
+        </w:rPr>
+        <w:t xml:space="preserve">    "maximum</w:t>
+      </w:r>
+      <w:proofErr w:type="gramStart"/>
+      <w:r>
+        <w:rPr>
+          <w:rFonts w:ascii="Courier New" w:eastAsia="Times New Roman" w:hAnsi="Courier New" w:cs="Courier New"/>
+          <w:color w:val="auto"/>
+          <w:kern w:val="0"/>
+          <w:sz w:val="20"/>
+          <w:szCs w:val="20"/>
+          <w:lang w:val="fr-FR" w:eastAsia="ja-JP" w:bidi="ar-SA"/>
+          <w14:ligatures w14:val="none"/>
+        </w:rPr>
+        <w:t>":</w:t>
+      </w:r>
+      <w:proofErr w:type="gramEnd"/>
+      <w:r>
+        <w:rPr>
+          <w:rFonts w:ascii="Courier New" w:eastAsia="Times New Roman" w:hAnsi="Courier New" w:cs="Courier New"/>
+          <w:color w:val="auto"/>
+          <w:kern w:val="0"/>
+          <w:sz w:val="20"/>
+          <w:szCs w:val="20"/>
+          <w:lang w:val="fr-FR" w:eastAsia="ja-JP" w:bidi="ar-SA"/>
+          <w14:ligatures w14:val="none"/>
+        </w:rPr>
+        <w:t xml:space="preserve"> 245.1,</w:t>
+      </w:r>
+    </w:p>
+    <w:p>
+      <w:pPr>
+        <w:pStyle w:val="Paragraphedeliste"/>
+        <w:numPr>
+          <w:ilvl w:val="0"/>
+          <w:numId w:val="10"/>
+        </w:numPr>
+        <w:tabs>
+          <w:tab w:val="left" w:pos="916"/>
+          <w:tab w:val="left" w:pos="1832"/>
+          <w:tab w:val="left" w:pos="2748"/>
+          <w:tab w:val="left" w:pos="3664"/>
+          <w:tab w:val="left" w:pos="4580"/>
+          <w:tab w:val="left" w:pos="5496"/>
+          <w:tab w:val="left" w:pos="6412"/>
+          <w:tab w:val="left" w:pos="7328"/>
+          <w:tab w:val="left" w:pos="8244"/>
+          <w:tab w:val="left" w:pos="9160"/>
+          <w:tab w:val="left" w:pos="10076"/>
+          <w:tab w:val="left" w:pos="10992"/>
+          <w:tab w:val="left" w:pos="11908"/>
+          <w:tab w:val="left" w:pos="12824"/>
+          <w:tab w:val="left" w:pos="13740"/>
+          <w:tab w:val="left" w:pos="14656"/>
+        </w:tabs>
+        <w:spacing w:after="0" w:line="240" w:lineRule="auto"/>
+        <w:rPr>
+          <w:rFonts w:ascii="Courier New" w:eastAsia="Times New Roman" w:hAnsi="Courier New" w:cs="Courier New"/>
+          <w:color w:val="auto"/>
+          <w:kern w:val="0"/>
+          <w:sz w:val="20"/>
+          <w:szCs w:val="20"/>
+          <w:lang w:val="fr-FR" w:eastAsia="ja-JP" w:bidi="ar-SA"/>
+          <w14:ligatures w14:val="none"/>
+        </w:rPr>
+      </w:pPr>
+      <w:r>
+        <w:rPr>
+          <w:rFonts w:ascii="Courier New" w:eastAsia="Times New Roman" w:hAnsi="Courier New" w:cs="Courier New"/>
+          <w:color w:val="auto"/>
+          <w:kern w:val="0"/>
+          <w:sz w:val="20"/>
+          <w:szCs w:val="20"/>
+          <w:lang w:val="fr-FR" w:eastAsia="ja-JP" w:bidi="ar-SA"/>
+          <w14:ligatures w14:val="none"/>
+        </w:rPr>
+        <w:t xml:space="preserve">    "</w:t>
+      </w:r>
+      <w:proofErr w:type="spellStart"/>
+      <w:r>
+        <w:rPr>
+          <w:rFonts w:ascii="Courier New" w:eastAsia="Times New Roman" w:hAnsi="Courier New" w:cs="Courier New"/>
+          <w:color w:val="auto"/>
+          <w:kern w:val="0"/>
+          <w:sz w:val="20"/>
+          <w:szCs w:val="20"/>
+          <w:lang w:val="fr-FR" w:eastAsia="ja-JP" w:bidi="ar-SA"/>
+          <w14:ligatures w14:val="none"/>
+        </w:rPr>
+        <w:t>mediane</w:t>
+      </w:r>
+      <w:proofErr w:type="spellEnd"/>
+      <w:proofErr w:type="gramStart"/>
+      <w:r>
+        <w:rPr>
+          <w:rFonts w:ascii="Courier New" w:eastAsia="Times New Roman" w:hAnsi="Courier New" w:cs="Courier New"/>
+          <w:color w:val="auto"/>
+          <w:kern w:val="0"/>
+          <w:sz w:val="20"/>
+          <w:szCs w:val="20"/>
+          <w:lang w:val="fr-FR" w:eastAsia="ja-JP" w:bidi="ar-SA"/>
+          <w14:ligatures w14:val="none"/>
+        </w:rPr>
+        <w:t>":</w:t>
+      </w:r>
+      <w:proofErr w:type="gramEnd"/>
+      <w:r>
+        <w:rPr>
+          <w:rFonts w:ascii="Courier New" w:eastAsia="Times New Roman" w:hAnsi="Courier New" w:cs="Courier New"/>
+          <w:color w:val="auto"/>
+          <w:kern w:val="0"/>
+          <w:sz w:val="20"/>
+          <w:szCs w:val="20"/>
+          <w:lang w:val="fr-FR" w:eastAsia="ja-JP" w:bidi="ar-SA"/>
+          <w14:ligatures w14:val="none"/>
+        </w:rPr>
+        <w:t xml:space="preserve"> 224.45,</w:t>
+      </w:r>
+    </w:p>
+    <w:p>
+      <w:pPr>
+        <w:pStyle w:val="Paragraphedeliste"/>
+        <w:numPr>
+          <w:ilvl w:val="0"/>
+          <w:numId w:val="10"/>
+        </w:numPr>
+        <w:tabs>
+          <w:tab w:val="left" w:pos="916"/>
+          <w:tab w:val="left" w:pos="1832"/>
+          <w:tab w:val="left" w:pos="2748"/>
+          <w:tab w:val="left" w:pos="3664"/>
+          <w:tab w:val="left" w:pos="4580"/>
+          <w:tab w:val="left" w:pos="5496"/>
+          <w:tab w:val="left" w:pos="6412"/>
+          <w:tab w:val="left" w:pos="7328"/>
+          <w:tab w:val="left" w:pos="8244"/>
+          <w:tab w:val="left" w:pos="9160"/>
+          <w:tab w:val="left" w:pos="10076"/>
+          <w:tab w:val="left" w:pos="10992"/>
+          <w:tab w:val="left" w:pos="11908"/>
+          <w:tab w:val="left" w:pos="12824"/>
+          <w:tab w:val="left" w:pos="13740"/>
+          <w:tab w:val="left" w:pos="14656"/>
+        </w:tabs>
+        <w:spacing w:after="0" w:line="240" w:lineRule="auto"/>
+        <w:rPr>
+          <w:rFonts w:ascii="Courier New" w:eastAsia="Times New Roman" w:hAnsi="Courier New" w:cs="Courier New"/>
+          <w:color w:val="auto"/>
+          <w:kern w:val="0"/>
+          <w:sz w:val="20"/>
+          <w:szCs w:val="20"/>
+          <w:lang w:val="fr-FR" w:eastAsia="ja-JP" w:bidi="ar-SA"/>
+          <w14:ligatures w14:val="none"/>
+        </w:rPr>
+      </w:pPr>
+      <w:r>
+        <w:rPr>
+          <w:rFonts w:ascii="Courier New" w:eastAsia="Times New Roman" w:hAnsi="Courier New" w:cs="Courier New"/>
+          <w:color w:val="auto"/>
+          <w:kern w:val="0"/>
+          <w:sz w:val="20"/>
+          <w:szCs w:val="20"/>
+          <w:lang w:val="fr-FR" w:eastAsia="ja-JP" w:bidi="ar-SA"/>
+          <w14:ligatures w14:val="none"/>
+        </w:rPr>
+        <w:t xml:space="preserve">    "minimum</w:t>
+      </w:r>
+      <w:proofErr w:type="gramStart"/>
+      <w:r>
+        <w:rPr>
+          <w:rFonts w:ascii="Courier New" w:eastAsia="Times New Roman" w:hAnsi="Courier New" w:cs="Courier New"/>
+          <w:color w:val="auto"/>
+          <w:kern w:val="0"/>
+          <w:sz w:val="20"/>
+          <w:szCs w:val="20"/>
+          <w:lang w:val="fr-FR" w:eastAsia="ja-JP" w:bidi="ar-SA"/>
+          <w14:ligatures w14:val="none"/>
+        </w:rPr>
+        <w:t>":</w:t>
+      </w:r>
+      <w:proofErr w:type="gramEnd"/>
+      <w:r>
+        <w:rPr>
+          <w:rFonts w:ascii="Courier New" w:eastAsia="Times New Roman" w:hAnsi="Courier New" w:cs="Courier New"/>
+          <w:color w:val="auto"/>
+          <w:kern w:val="0"/>
+          <w:sz w:val="20"/>
+          <w:szCs w:val="20"/>
+          <w:lang w:val="fr-FR" w:eastAsia="ja-JP" w:bidi="ar-SA"/>
+          <w14:ligatures w14:val="none"/>
+        </w:rPr>
+        <w:t xml:space="preserve"> 198.2,</w:t>
+      </w:r>
+    </w:p>
+    <w:p>
+      <w:pPr>
+        <w:pStyle w:val="Paragraphedeliste"/>
+        <w:numPr>
+          <w:ilvl w:val="0"/>
+          <w:numId w:val="10"/>
+        </w:numPr>
+        <w:tabs>
+          <w:tab w:val="left" w:pos="916"/>
+          <w:tab w:val="left" w:pos="1832"/>
+          <w:tab w:val="left" w:pos="2748"/>
+          <w:tab w:val="left" w:pos="3664"/>
+          <w:tab w:val="left" w:pos="4580"/>
+          <w:tab w:val="left" w:pos="5496"/>
+          <w:tab w:val="left" w:pos="6412"/>
+          <w:tab w:val="left" w:pos="7328"/>
+          <w:tab w:val="left" w:pos="8244"/>
+          <w:tab w:val="left" w:pos="9160"/>
+          <w:tab w:val="left" w:pos="10076"/>
+          <w:tab w:val="left" w:pos="10992"/>
+          <w:tab w:val="left" w:pos="11908"/>
+          <w:tab w:val="left" w:pos="12824"/>
+          <w:tab w:val="left" w:pos="13740"/>
+          <w:tab w:val="left" w:pos="14656"/>
+        </w:tabs>
+        <w:spacing w:after="0" w:line="240" w:lineRule="auto"/>
+        <w:rPr>
+          <w:rFonts w:ascii="Courier New" w:eastAsia="Times New Roman" w:hAnsi="Courier New" w:cs="Courier New"/>
+          <w:color w:val="auto"/>
+          <w:kern w:val="0"/>
+          <w:sz w:val="20"/>
+          <w:szCs w:val="20"/>
+          <w:lang w:val="fr-FR" w:eastAsia="ja-JP" w:bidi="ar-SA"/>
+          <w14:ligatures w14:val="none"/>
+        </w:rPr>
+      </w:pPr>
+      <w:r>
+        <w:rPr>
+          <w:rFonts w:ascii="Courier New" w:eastAsia="Times New Roman" w:hAnsi="Courier New" w:cs="Courier New"/>
+          <w:color w:val="auto"/>
+          <w:kern w:val="0"/>
+          <w:sz w:val="20"/>
+          <w:szCs w:val="20"/>
+          <w:lang w:val="fr-FR" w:eastAsia="ja-JP" w:bidi="ar-SA"/>
+          <w14:ligatures w14:val="none"/>
+        </w:rPr>
+        <w:t xml:space="preserve">    "moyenne</w:t>
+      </w:r>
+      <w:proofErr w:type="gramStart"/>
+      <w:r>
+        <w:rPr>
+          <w:rFonts w:ascii="Courier New" w:eastAsia="Times New Roman" w:hAnsi="Courier New" w:cs="Courier New"/>
+          <w:color w:val="auto"/>
+          <w:kern w:val="0"/>
+          <w:sz w:val="20"/>
+          <w:szCs w:val="20"/>
+          <w:lang w:val="fr-FR" w:eastAsia="ja-JP" w:bidi="ar-SA"/>
+          <w14:ligatures w14:val="none"/>
+        </w:rPr>
+        <w:t>":</w:t>
+      </w:r>
+      <w:proofErr w:type="gramEnd"/>
+      <w:r>
+        <w:rPr>
+          <w:rFonts w:ascii="Courier New" w:eastAsia="Times New Roman" w:hAnsi="Courier New" w:cs="Courier New"/>
+          <w:color w:val="auto"/>
+          <w:kern w:val="0"/>
+          <w:sz w:val="20"/>
+          <w:szCs w:val="20"/>
+          <w:lang w:val="fr-FR" w:eastAsia="ja-JP" w:bidi="ar-SA"/>
+          <w14:ligatures w14:val="none"/>
+        </w:rPr>
+        <w:t xml:space="preserve"> 223.15,</w:t>
+      </w:r>
+    </w:p>
+    <w:p>
+      <w:pPr>
+        <w:pStyle w:val="Paragraphedeliste"/>
+        <w:numPr>
+          <w:ilvl w:val="0"/>
+          <w:numId w:val="10"/>
+        </w:numPr>
+        <w:tabs>
+          <w:tab w:val="left" w:pos="916"/>
+          <w:tab w:val="left" w:pos="1832"/>
+          <w:tab w:val="left" w:pos="2748"/>
+          <w:tab w:val="left" w:pos="3664"/>
+          <w:tab w:val="left" w:pos="4580"/>
+          <w:tab w:val="left" w:pos="5496"/>
+          <w:tab w:val="left" w:pos="6412"/>
+          <w:tab w:val="left" w:pos="7328"/>
+          <w:tab w:val="left" w:pos="8244"/>
+          <w:tab w:val="left" w:pos="9160"/>
+          <w:tab w:val="left" w:pos="10076"/>
+          <w:tab w:val="left" w:pos="10992"/>
+          <w:tab w:val="left" w:pos="11908"/>
+          <w:tab w:val="left" w:pos="12824"/>
+          <w:tab w:val="left" w:pos="13740"/>
+          <w:tab w:val="left" w:pos="14656"/>
+        </w:tabs>
+        <w:spacing w:after="0" w:line="240" w:lineRule="auto"/>
+        <w:rPr>
+          <w:rFonts w:ascii="Courier New" w:eastAsia="Times New Roman" w:hAnsi="Courier New" w:cs="Courier New"/>
+          <w:color w:val="auto"/>
+          <w:kern w:val="0"/>
+          <w:sz w:val="20"/>
+          <w:szCs w:val="20"/>
+          <w:lang w:val="fr-FR" w:eastAsia="ja-JP" w:bidi="ar-SA"/>
+          <w14:ligatures w14:val="none"/>
+        </w:rPr>
+      </w:pPr>
+      <w:r>
+        <w:rPr>
+          <w:rFonts w:ascii="Courier New" w:eastAsia="Times New Roman" w:hAnsi="Courier New" w:cs="Courier New"/>
+          <w:color w:val="auto"/>
+          <w:kern w:val="0"/>
+          <w:sz w:val="20"/>
+          <w:szCs w:val="20"/>
+          <w:lang w:val="fr-FR" w:eastAsia="ja-JP" w:bidi="ar-SA"/>
+          <w14:ligatures w14:val="none"/>
+        </w:rPr>
+        <w:t xml:space="preserve">    "n</w:t>
+      </w:r>
+      <w:proofErr w:type="gramStart"/>
+      <w:r>
+        <w:rPr>
+          <w:rFonts w:ascii="Courier New" w:eastAsia="Times New Roman" w:hAnsi="Courier New" w:cs="Courier New"/>
+          <w:color w:val="auto"/>
+          <w:kern w:val="0"/>
+          <w:sz w:val="20"/>
+          <w:szCs w:val="20"/>
+          <w:lang w:val="fr-FR" w:eastAsia="ja-JP" w:bidi="ar-SA"/>
+          <w14:ligatures w14:val="none"/>
+        </w:rPr>
+        <w:t>":</w:t>
+      </w:r>
+      <w:proofErr w:type="gramEnd"/>
+      <w:r>
+        <w:rPr>
+          <w:rFonts w:ascii="Courier New" w:eastAsia="Times New Roman" w:hAnsi="Courier New" w:cs="Courier New"/>
+          <w:color w:val="auto"/>
+          <w:kern w:val="0"/>
+          <w:sz w:val="20"/>
+          <w:szCs w:val="20"/>
+          <w:lang w:val="fr-FR" w:eastAsia="ja-JP" w:bidi="ar-SA"/>
+          <w14:ligatures w14:val="none"/>
+        </w:rPr>
+        <w:t xml:space="preserve"> 18,</w:t>
+      </w:r>
+    </w:p>
+    <w:p>
+      <w:pPr>
+        <w:pStyle w:val="Paragraphedeliste"/>
+        <w:numPr>
+          <w:ilvl w:val="0"/>
+          <w:numId w:val="10"/>
+        </w:numPr>
+        <w:tabs>
+          <w:tab w:val="left" w:pos="916"/>
+          <w:tab w:val="left" w:pos="1832"/>
+          <w:tab w:val="left" w:pos="2748"/>
+          <w:tab w:val="left" w:pos="3664"/>
+          <w:tab w:val="left" w:pos="4580"/>
+          <w:tab w:val="left" w:pos="5496"/>
+          <w:tab w:val="left" w:pos="6412"/>
+          <w:tab w:val="left" w:pos="7328"/>
+          <w:tab w:val="left" w:pos="8244"/>
+          <w:tab w:val="left" w:pos="9160"/>
+          <w:tab w:val="left" w:pos="10076"/>
+          <w:tab w:val="left" w:pos="10992"/>
+          <w:tab w:val="left" w:pos="11908"/>
+          <w:tab w:val="left" w:pos="12824"/>
+          <w:tab w:val="left" w:pos="13740"/>
+          <w:tab w:val="left" w:pos="14656"/>
+        </w:tabs>
+        <w:spacing w:after="0" w:line="240" w:lineRule="auto"/>
+        <w:rPr>
+          <w:rFonts w:ascii="Courier New" w:eastAsia="Times New Roman" w:hAnsi="Courier New" w:cs="Courier New"/>
+          <w:color w:val="auto"/>
+          <w:kern w:val="0"/>
+          <w:sz w:val="20"/>
+          <w:szCs w:val="20"/>
+          <w:lang w:val="fr-FR" w:eastAsia="ja-JP" w:bidi="ar-SA"/>
+          <w14:ligatures w14:val="none"/>
+        </w:rPr>
+      </w:pPr>
+      <w:r>
+        <w:rPr>
+          <w:rFonts w:ascii="Courier New" w:eastAsia="Times New Roman" w:hAnsi="Courier New" w:cs="Courier New"/>
+          <w:color w:val="auto"/>
+          <w:kern w:val="0"/>
+          <w:sz w:val="20"/>
+          <w:szCs w:val="20"/>
+          <w:lang w:val="fr-FR" w:eastAsia="ja-JP" w:bidi="ar-SA"/>
+          <w14:ligatures w14:val="none"/>
+        </w:rPr>
+        <w:t xml:space="preserve">    "</w:t>
+      </w:r>
+      <w:proofErr w:type="spellStart"/>
+      <w:r>
+        <w:rPr>
+          <w:rFonts w:ascii="Courier New" w:eastAsia="Times New Roman" w:hAnsi="Courier New" w:cs="Courier New"/>
+          <w:color w:val="auto"/>
+          <w:kern w:val="0"/>
+          <w:sz w:val="20"/>
+          <w:szCs w:val="20"/>
+          <w:lang w:val="fr-FR" w:eastAsia="ja-JP" w:bidi="ar-SA"/>
+          <w14:ligatures w14:val="none"/>
+        </w:rPr>
+        <w:t>serie</w:t>
+      </w:r>
+      <w:proofErr w:type="spellEnd"/>
+      <w:proofErr w:type="gramStart"/>
+      <w:r>
+        <w:rPr>
+          <w:rFonts w:ascii="Courier New" w:eastAsia="Times New Roman" w:hAnsi="Courier New" w:cs="Courier New"/>
+          <w:color w:val="auto"/>
+          <w:kern w:val="0"/>
+          <w:sz w:val="20"/>
+          <w:szCs w:val="20"/>
+          <w:lang w:val="fr-FR" w:eastAsia="ja-JP" w:bidi="ar-SA"/>
+          <w14:ligatures w14:val="none"/>
+        </w:rPr>
+        <w:t>":</w:t>
+      </w:r>
+      <w:proofErr w:type="gramEnd"/>
+      <w:r>
+        <w:rPr>
+          <w:rFonts w:ascii="Courier New" w:eastAsia="Times New Roman" w:hAnsi="Courier New" w:cs="Courier New"/>
+          <w:color w:val="auto"/>
+          <w:kern w:val="0"/>
+          <w:sz w:val="20"/>
+          <w:szCs w:val="20"/>
+          <w:lang w:val="fr-FR" w:eastAsia="ja-JP" w:bidi="ar-SA"/>
+          <w14:ligatures w14:val="none"/>
+        </w:rPr>
+        <w:t xml:space="preserve"> "</w:t>
+      </w:r>
+      <w:proofErr w:type="spellStart"/>
+      <w:r>
+        <w:rPr>
+          <w:rFonts w:ascii="Courier New" w:eastAsia="Times New Roman" w:hAnsi="Courier New" w:cs="Courier New"/>
+          <w:color w:val="auto"/>
+          <w:kern w:val="0"/>
+          <w:sz w:val="20"/>
+          <w:szCs w:val="20"/>
+          <w:lang w:val="fr-FR" w:eastAsia="ja-JP" w:bidi="ar-SA"/>
+          <w14:ligatures w14:val="none"/>
+        </w:rPr>
+        <w:t>serie_C</w:t>
+      </w:r>
+      <w:proofErr w:type="spellEnd"/>
+      <w:r>
+        <w:rPr>
+          <w:rFonts w:ascii="Courier New" w:eastAsia="Times New Roman" w:hAnsi="Courier New" w:cs="Courier New"/>
+          <w:color w:val="auto"/>
+          <w:kern w:val="0"/>
+          <w:sz w:val="20"/>
+          <w:szCs w:val="20"/>
+          <w:lang w:val="fr-FR" w:eastAsia="ja-JP" w:bidi="ar-SA"/>
+          <w14:ligatures w14:val="none"/>
+        </w:rPr>
+        <w:t>"</w:t>
+      </w:r>
+    </w:p>
+    <w:p>
+      <w:pPr>
+        <w:pStyle w:val="Paragraphedeliste"/>
+        <w:numPr>
+          <w:ilvl w:val="0"/>
+          <w:numId w:val="10"/>
+        </w:numPr>
+        <w:tabs>
+          <w:tab w:val="left" w:pos="916"/>
+          <w:tab w:val="left" w:pos="1832"/>
+          <w:tab w:val="left" w:pos="2748"/>
+          <w:tab w:val="left" w:pos="3664"/>
+          <w:tab w:val="left" w:pos="4580"/>
+          <w:tab w:val="left" w:pos="5496"/>
+          <w:tab w:val="left" w:pos="6412"/>
+          <w:tab w:val="left" w:pos="7328"/>
+          <w:tab w:val="left" w:pos="8244"/>
+          <w:tab w:val="left" w:pos="9160"/>
+          <w:tab w:val="left" w:pos="10076"/>
+          <w:tab w:val="left" w:pos="10992"/>
+          <w:tab w:val="left" w:pos="11908"/>
+          <w:tab w:val="left" w:pos="12824"/>
+          <w:tab w:val="left" w:pos="13740"/>
+          <w:tab w:val="left" w:pos="14656"/>
+        </w:tabs>
+        <w:spacing w:after="0" w:line="240" w:lineRule="auto"/>
+        <w:rPr>
+          <w:rFonts w:ascii="Courier New" w:eastAsia="Times New Roman" w:hAnsi="Courier New" w:cs="Courier New"/>
+          <w:color w:val="auto"/>
+          <w:kern w:val="0"/>
+          <w:sz w:val="20"/>
+          <w:szCs w:val="20"/>
+          <w:lang w:val="fr-FR" w:eastAsia="ja-JP" w:bidi="ar-SA"/>
+          <w14:ligatures w14:val="none"/>
+        </w:rPr>
+      </w:pPr>
+      <w:r>
+        <w:rPr>
+          <w:rFonts w:ascii="Courier New" w:eastAsia="Times New Roman" w:hAnsi="Courier New" w:cs="Courier New"/>
+          <w:color w:val="auto"/>
+          <w:kern w:val="0"/>
+          <w:sz w:val="20"/>
+          <w:szCs w:val="20"/>
+          <w:lang w:val="fr-FR" w:eastAsia="ja-JP" w:bidi="ar-SA"/>
+          <w14:ligatures w14:val="none"/>
+        </w:rPr>
+        <w:t xml:space="preserve">  },</w:t>
+      </w:r>
+    </w:p>
+    <w:p>
+      <w:pPr>
+        <w:pStyle w:val="Paragraphedeliste"/>
+        <w:numPr>
+          <w:ilvl w:val="0"/>
+          <w:numId w:val="10"/>
+        </w:numPr>
+        <w:tabs>
+          <w:tab w:val="left" w:pos="916"/>
+          <w:tab w:val="left" w:pos="1832"/>
+          <w:tab w:val="left" w:pos="2748"/>
+          <w:tab w:val="left" w:pos="3664"/>
+          <w:tab w:val="left" w:pos="4580"/>
+          <w:tab w:val="left" w:pos="5496"/>
+          <w:tab w:val="left" w:pos="6412"/>
+          <w:tab w:val="left" w:pos="7328"/>
+          <w:tab w:val="left" w:pos="8244"/>
+          <w:tab w:val="left" w:pos="9160"/>
+          <w:tab w:val="left" w:pos="10076"/>
+          <w:tab w:val="left" w:pos="10992"/>
+          <w:tab w:val="left" w:pos="11908"/>
+          <w:tab w:val="left" w:pos="12824"/>
+          <w:tab w:val="left" w:pos="13740"/>
+          <w:tab w:val="left" w:pos="14656"/>
+        </w:tabs>
+        <w:spacing w:after="0" w:line="240" w:lineRule="auto"/>
+        <w:rPr>
+          <w:rFonts w:ascii="Courier New" w:eastAsia="Times New Roman" w:hAnsi="Courier New" w:cs="Courier New"/>
+          <w:color w:val="auto"/>
+          <w:kern w:val="0"/>
+          <w:sz w:val="20"/>
+          <w:szCs w:val="20"/>
+          <w:lang w:val="fr-FR" w:eastAsia="ja-JP" w:bidi="ar-SA"/>
+          <w14:ligatures w14:val="none"/>
+        </w:rPr>
+      </w:pPr>
+      <w:r>
+        <w:rPr>
+          <w:rFonts w:ascii="Courier New" w:eastAsia="Times New Roman" w:hAnsi="Courier New" w:cs="Courier New"/>
+          <w:color w:val="auto"/>
+          <w:kern w:val="0"/>
+          <w:sz w:val="20"/>
+          <w:szCs w:val="20"/>
+          <w:lang w:val="fr-FR" w:eastAsia="ja-JP" w:bidi="ar-SA"/>
+          <w14:ligatures w14:val="none"/>
+        </w:rPr>
+        <w:t xml:space="preserve">  "source</w:t>
+      </w:r>
+      <w:proofErr w:type="gramStart"/>
+      <w:r>
+        <w:rPr>
+          <w:rFonts w:ascii="Courier New" w:eastAsia="Times New Roman" w:hAnsi="Courier New" w:cs="Courier New"/>
+          <w:color w:val="auto"/>
+          <w:kern w:val="0"/>
+          <w:sz w:val="20"/>
+          <w:szCs w:val="20"/>
+          <w:lang w:val="fr-FR" w:eastAsia="ja-JP" w:bidi="ar-SA"/>
+          <w14:ligatures w14:val="none"/>
+        </w:rPr>
+        <w:t>":</w:t>
+      </w:r>
+      <w:proofErr w:type="gramEnd"/>
+      <w:r>
+        <w:rPr>
+          <w:rFonts w:ascii="Courier New" w:eastAsia="Times New Roman" w:hAnsi="Courier New" w:cs="Courier New"/>
+          <w:color w:val="auto"/>
+          <w:kern w:val="0"/>
+          <w:sz w:val="20"/>
+          <w:szCs w:val="20"/>
+          <w:lang w:val="fr-FR" w:eastAsia="ja-JP" w:bidi="ar-SA"/>
+          <w14:ligatures w14:val="none"/>
+        </w:rPr>
+        <w:t xml:space="preserve"> "</w:t>
+      </w:r>
+      <w:proofErr w:type="spellStart"/>
+      <w:r>
+        <w:rPr>
+          <w:rFonts w:ascii="Courier New" w:eastAsia="Times New Roman" w:hAnsi="Courier New" w:cs="Courier New"/>
+          <w:color w:val="auto"/>
+          <w:kern w:val="0"/>
+          <w:sz w:val="20"/>
+          <w:szCs w:val="20"/>
+          <w:lang w:val="fr-FR" w:eastAsia="ja-JP" w:bidi="ar-SA"/>
+          <w14:ligatures w14:val="none"/>
+        </w:rPr>
+        <w:t>mysql</w:t>
+      </w:r>
+      <w:proofErr w:type="spellEnd"/>
+      <w:r>
+        <w:rPr>
+          <w:rFonts w:ascii="Courier New" w:eastAsia="Times New Roman" w:hAnsi="Courier New" w:cs="Courier New"/>
+          <w:color w:val="auto"/>
+          <w:kern w:val="0"/>
+          <w:sz w:val="20"/>
+          <w:szCs w:val="20"/>
+          <w:lang w:val="fr-FR" w:eastAsia="ja-JP" w:bidi="ar-SA"/>
+          <w14:ligatures w14:val="none"/>
+        </w:rPr>
+        <w:t>"</w:t>
+      </w:r>
+    </w:p>
+    <w:p>
+      <w:pPr>
+        <w:pStyle w:val="Paragraphedeliste"/>
+        <w:numPr>
+          <w:ilvl w:val="0"/>
+          <w:numId w:val="10"/>
+        </w:numPr>
+        <w:tabs>
+          <w:tab w:val="left" w:pos="916"/>
+          <w:tab w:val="left" w:pos="1832"/>
+          <w:tab w:val="left" w:pos="2748"/>
+          <w:tab w:val="left" w:pos="3664"/>
+          <w:tab w:val="left" w:pos="4580"/>
+          <w:tab w:val="left" w:pos="5496"/>
+          <w:tab w:val="left" w:pos="6412"/>
+          <w:tab w:val="left" w:pos="7328"/>
+          <w:tab w:val="left" w:pos="8244"/>
+          <w:tab w:val="left" w:pos="9160"/>
+          <w:tab w:val="left" w:pos="10076"/>
+          <w:tab w:val="left" w:pos="10992"/>
+          <w:tab w:val="left" w:pos="11908"/>
+          <w:tab w:val="left" w:pos="12824"/>
+          <w:tab w:val="left" w:pos="13740"/>
+          <w:tab w:val="left" w:pos="14656"/>
+        </w:tabs>
+        <w:spacing w:after="0" w:line="240" w:lineRule="auto"/>
+        <w:rPr>
+          <w:rFonts w:ascii="Courier New" w:eastAsia="Times New Roman" w:hAnsi="Courier New" w:cs="Courier New"/>
+          <w:color w:val="auto"/>
+          <w:kern w:val="0"/>
+          <w:sz w:val="20"/>
+          <w:szCs w:val="20"/>
+          <w:lang w:val="fr-FR" w:eastAsia="ja-JP" w:bidi="ar-SA"/>
+          <w14:ligatures w14:val="none"/>
+        </w:rPr>
+      </w:pPr>
+      <w:r>
+        <w:rPr>
+          <w:rFonts w:ascii="Courier New" w:eastAsia="Times New Roman" w:hAnsi="Courier New" w:cs="Courier New"/>
+          <w:color w:val="auto"/>
+          <w:kern w:val="0"/>
+          <w:sz w:val="20"/>
+          <w:szCs w:val="20"/>
+          <w:lang w:val="fr-FR" w:eastAsia="ja-JP" w:bidi="ar-SA"/>
+          <w14:ligatures w14:val="none"/>
+        </w:rPr>
+        <w:t>}</w:t>
+      </w:r>
+    </w:p>
+    <w:p>
+      <w:pPr>
+        <w:spacing w:after="4" w:line="261" w:lineRule="auto"/>
+        <w:ind w:left="705" w:right="14"/>
+        <w:jc w:val="both"/>
+        <w:rPr>
+          <w:lang w:val="fr-FR"/>
+        </w:rPr>
+      </w:pPr>
+    </w:p>
+    <w:p>
+      <w:pPr>
         <w:spacing w:after="4" w:line="261" w:lineRule="auto"/>
         <w:ind w:right="14"/>
         <w:jc w:val="both"/>
@@ -1752,6 +3225,287 @@
       </w:pPr>
       <w:r>
         <w:t>Questions de vérification — Service 5</w:t>
+      </w:r>
+    </w:p>
+    <w:p>
+      <w:pPr>
+        <w:rPr>
+          <w:lang w:val="fr-FR" w:eastAsia="fr-FR" w:bidi="ar-SA"/>
+        </w:rPr>
+      </w:pPr>
+    </w:p>
+    <w:p>
+      <w:pPr>
+        <w:rPr>
+          <w:lang w:val="fr-FR" w:eastAsia="fr-FR" w:bidi="ar-SA"/>
+        </w:rPr>
+      </w:pPr>
+      <w:r>
+        <w:rPr>
+          <w:lang w:val="fr-FR" w:eastAsia="fr-FR" w:bidi="ar-SA"/>
+        </w:rPr>
+        <w:t>6.7</w:t>
+      </w:r>
+    </w:p>
+    <w:p>
+      <w:pPr>
+        <w:rPr>
+          <w:lang w:val="fr-FR" w:eastAsia="fr-FR" w:bidi="ar-SA"/>
+        </w:rPr>
+      </w:pPr>
+      <w:r>
+        <w:rPr>
+          <w:lang w:val="fr-FR" w:eastAsia="fr-FR" w:bidi="ar-SA"/>
+        </w:rPr>
+        <w:drawing>
+          <wp:inline distT="0" distB="0" distL="0" distR="0" wp14:anchorId="64693797" wp14:editId="1BF8508A">
+            <wp:extent cx="6043295" cy="497840"/>
+            <wp:effectExtent l="0" t="0" r="0" b="0"/>
+            <wp:docPr id="1816001782" name="Image 1"/>
+            <wp:cNvGraphicFramePr>
+              <a:graphicFrameLocks xmlns:a="http://schemas.openxmlformats.org/drawingml/2006/main" noChangeAspect="1"/>
+            </wp:cNvGraphicFramePr>
+            <a:graphic xmlns:a="http://schemas.openxmlformats.org/drawingml/2006/main">
+              <a:graphicData uri="http://schemas.openxmlformats.org/drawingml/2006/picture">
+                <pic:pic xmlns:pic="http://schemas.openxmlformats.org/drawingml/2006/picture">
+                  <pic:nvPicPr>
+                    <pic:cNvPr id="1816001782" name=""/>
+                    <pic:cNvPicPr/>
+                  </pic:nvPicPr>
+                  <pic:blipFill>
+                    <a:blip r:embed="rId12"/>
+                    <a:stretch>
+                      <a:fillRect/>
+                    </a:stretch>
+                  </pic:blipFill>
+                  <pic:spPr>
+                    <a:xfrm>
+                      <a:off x="0" y="0"/>
+                      <a:ext cx="6043295" cy="497840"/>
+                    </a:xfrm>
+                    <a:prstGeom prst="rect">
+                      <a:avLst/>
+                    </a:prstGeom>
+                  </pic:spPr>
+                </pic:pic>
+              </a:graphicData>
+            </a:graphic>
+          </wp:inline>
+        </w:drawing>
+      </w:r>
+      <w:r>
+        <w:rPr>
+          <w:noProof/>
+          <w:lang w:val="fr-FR" w:eastAsia="fr-FR" w:bidi="ar-SA"/>
+        </w:rPr>
+        <w:drawing>
+          <wp:inline distT="0" distB="0" distL="0" distR="0" wp14:anchorId="6B1ED4F7" wp14:editId="2C7FBB03">
+            <wp:extent cx="7620000" cy="762000"/>
+            <wp:effectExtent l="0" t="0" r="0" b="0"/>
+            <wp:docPr id="1678616243" name="Image 20"/>
+            <wp:cNvGraphicFramePr>
+              <a:graphicFrameLocks xmlns:a="http://schemas.openxmlformats.org/drawingml/2006/main" noChangeAspect="1"/>
+            </wp:cNvGraphicFramePr>
+            <a:graphic xmlns:a="http://schemas.openxmlformats.org/drawingml/2006/main">
+              <a:graphicData uri="http://schemas.openxmlformats.org/drawingml/2006/picture">
+                <pic:pic xmlns:pic="http://schemas.openxmlformats.org/drawingml/2006/picture">
+                  <pic:nvPicPr>
+                    <pic:cNvPr id="0" name="Picture 2"/>
+                    <pic:cNvPicPr>
+                      <a:picLocks noChangeAspect="1" noChangeArrowheads="1"/>
+                    </pic:cNvPicPr>
+                  </pic:nvPicPr>
+                  <pic:blipFill>
+                    <a:blip r:embed="rId13">
+                      <a:extLst>
+                        <a:ext uri="{28A0092B-C50C-407E-A947-70E740481C1C}">
+                          <a14:useLocalDpi xmlns:a14="http://schemas.microsoft.com/office/drawing/2010/main" val="0"/>
+                        </a:ext>
+                      </a:extLst>
+                    </a:blip>
+                    <a:srcRect/>
+                    <a:stretch>
+                      <a:fillRect/>
+                    </a:stretch>
+                  </pic:blipFill>
+                  <pic:spPr bwMode="auto">
+                    <a:xfrm>
+                      <a:off x="0" y="0"/>
+                      <a:ext cx="7620000" cy="762000"/>
+                    </a:xfrm>
+                    <a:prstGeom prst="rect">
+                      <a:avLst/>
+                    </a:prstGeom>
+                    <a:noFill/>
+                  </pic:spPr>
+                </pic:pic>
+              </a:graphicData>
+            </a:graphic>
+          </wp:inline>
+        </w:drawing>
+      </w:r>
+    </w:p>
+    <w:p>
+      <w:pPr>
+        <w:spacing w:after="112"/>
+      </w:pPr>
+    </w:p>
+    <w:p>
+      <w:pPr>
+        <w:spacing w:after="112"/>
+      </w:pPr>
+      <w:r>
+        <w:rPr>
+          <w:noProof/>
+        </w:rPr>
+        <w:lastRenderedPageBreak/>
+        <w:drawing>
+          <wp:inline distT="0" distB="0" distL="0" distR="0" wp14:anchorId="578582AF" wp14:editId="7BE8FD04">
+            <wp:extent cx="6043295" cy="1066064"/>
+            <wp:effectExtent l="0" t="0" r="0" b="1270"/>
+            <wp:docPr id="1854781291" name="Image 24"/>
+            <wp:cNvGraphicFramePr>
+              <a:graphicFrameLocks xmlns:a="http://schemas.openxmlformats.org/drawingml/2006/main" noChangeAspect="1"/>
+            </wp:cNvGraphicFramePr>
+            <a:graphic xmlns:a="http://schemas.openxmlformats.org/drawingml/2006/main">
+              <a:graphicData uri="http://schemas.openxmlformats.org/drawingml/2006/picture">
+                <pic:pic xmlns:pic="http://schemas.openxmlformats.org/drawingml/2006/picture">
+                  <pic:nvPicPr>
+                    <pic:cNvPr id="0" name="Picture 3"/>
+                    <pic:cNvPicPr>
+                      <a:picLocks noChangeAspect="1" noChangeArrowheads="1"/>
+                    </pic:cNvPicPr>
+                  </pic:nvPicPr>
+                  <pic:blipFill>
+                    <a:blip r:embed="rId14">
+                      <a:extLst>
+                        <a:ext uri="{28A0092B-C50C-407E-A947-70E740481C1C}">
+                          <a14:useLocalDpi xmlns:a14="http://schemas.microsoft.com/office/drawing/2010/main" val="0"/>
+                        </a:ext>
+                      </a:extLst>
+                    </a:blip>
+                    <a:srcRect/>
+                    <a:stretch>
+                      <a:fillRect/>
+                    </a:stretch>
+                  </pic:blipFill>
+                  <pic:spPr bwMode="auto">
+                    <a:xfrm>
+                      <a:off x="0" y="0"/>
+                      <a:ext cx="6043295" cy="1066064"/>
+                    </a:xfrm>
+                    <a:prstGeom prst="rect">
+                      <a:avLst/>
+                    </a:prstGeom>
+                    <a:noFill/>
+                  </pic:spPr>
+                </pic:pic>
+              </a:graphicData>
+            </a:graphic>
+          </wp:inline>
+        </w:drawing>
+      </w:r>
+      <w:r>
+        <w:rPr>
+          <w:noProof/>
+        </w:rPr>
+        <w:drawing>
+          <wp:inline distT="0" distB="0" distL="0" distR="0" wp14:anchorId="1CE6574F" wp14:editId="2B3ACB10">
+            <wp:extent cx="7667625" cy="2390775"/>
+            <wp:effectExtent l="0" t="0" r="9525" b="9525"/>
+            <wp:docPr id="52446740" name="Image 26"/>
+            <wp:cNvGraphicFramePr>
+              <a:graphicFrameLocks xmlns:a="http://schemas.openxmlformats.org/drawingml/2006/main" noChangeAspect="1"/>
+            </wp:cNvGraphicFramePr>
+            <a:graphic xmlns:a="http://schemas.openxmlformats.org/drawingml/2006/main">
+              <a:graphicData uri="http://schemas.openxmlformats.org/drawingml/2006/picture">
+                <pic:pic xmlns:pic="http://schemas.openxmlformats.org/drawingml/2006/picture">
+                  <pic:nvPicPr>
+                    <pic:cNvPr id="0" name="Picture 4"/>
+                    <pic:cNvPicPr>
+                      <a:picLocks noChangeAspect="1" noChangeArrowheads="1"/>
+                    </pic:cNvPicPr>
+                  </pic:nvPicPr>
+                  <pic:blipFill>
+                    <a:blip r:embed="rId15">
+                      <a:extLst>
+                        <a:ext uri="{28A0092B-C50C-407E-A947-70E740481C1C}">
+                          <a14:useLocalDpi xmlns:a14="http://schemas.microsoft.com/office/drawing/2010/main" val="0"/>
+                        </a:ext>
+                      </a:extLst>
+                    </a:blip>
+                    <a:srcRect/>
+                    <a:stretch>
+                      <a:fillRect/>
+                    </a:stretch>
+                  </pic:blipFill>
+                  <pic:spPr bwMode="auto">
+                    <a:xfrm>
+                      <a:off x="0" y="0"/>
+                      <a:ext cx="7667625" cy="2390775"/>
+                    </a:xfrm>
+                    <a:prstGeom prst="rect">
+                      <a:avLst/>
+                    </a:prstGeom>
+                    <a:noFill/>
+                  </pic:spPr>
+                </pic:pic>
+              </a:graphicData>
+            </a:graphic>
+          </wp:inline>
+        </w:drawing>
+      </w:r>
+    </w:p>
+    <w:p>
+      <w:pPr>
+        <w:spacing w:after="112"/>
+        <w:ind w:left="-2"/>
+      </w:pPr>
+      <w:r>
+        <w:t>6.8</w:t>
+      </w:r>
+    </w:p>
+    <w:p>
+      <w:pPr>
+        <w:spacing w:after="112"/>
+        <w:ind w:left="-2"/>
+      </w:pPr>
+      <w:r>
+        <w:drawing>
+          <wp:inline distT="0" distB="0" distL="0" distR="0" wp14:anchorId="5F4F5FC9" wp14:editId="031A8D79">
+            <wp:extent cx="3324689" cy="685896"/>
+            <wp:effectExtent l="0" t="0" r="0" b="0"/>
+            <wp:docPr id="1721326917" name="Image 1"/>
+            <wp:cNvGraphicFramePr>
+              <a:graphicFrameLocks xmlns:a="http://schemas.openxmlformats.org/drawingml/2006/main" noChangeAspect="1"/>
+            </wp:cNvGraphicFramePr>
+            <a:graphic xmlns:a="http://schemas.openxmlformats.org/drawingml/2006/main">
+              <a:graphicData uri="http://schemas.openxmlformats.org/drawingml/2006/picture">
+                <pic:pic xmlns:pic="http://schemas.openxmlformats.org/drawingml/2006/picture">
+                  <pic:nvPicPr>
+                    <pic:cNvPr id="1721326917" name=""/>
+                    <pic:cNvPicPr/>
+                  </pic:nvPicPr>
+                  <pic:blipFill>
+                    <a:blip r:embed="rId16"/>
+                    <a:stretch>
+                      <a:fillRect/>
+                    </a:stretch>
+                  </pic:blipFill>
+                  <pic:spPr>
+                    <a:xfrm>
+                      <a:off x="0" y="0"/>
+                      <a:ext cx="3324689" cy="685896"/>
+                    </a:xfrm>
+                    <a:prstGeom prst="rect">
+                      <a:avLst/>
+                    </a:prstGeom>
+                  </pic:spPr>
+                </pic:pic>
+              </a:graphicData>
+            </a:graphic>
+          </wp:inline>
+        </w:drawing>
       </w:r>
     </w:p>
     <w:p>
@@ -1881,7 +3635,7 @@
           </mc:Choice>
           <mc:Fallback>
             <w:pict>
-              <v:group w14:anchorId="3A351FC9" id="Group 86405" o:spid="_x0000_s1026" style="width:475.25pt;height:.5pt;mso-position-horizontal-relative:char;mso-position-vertical-relative:line" coordsize="60356,63" o:gfxdata="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">
+              <v:group w14:anchorId="2F50B217" id="Group 86405" o:spid="_x0000_s1026" style="width:475.25pt;height:.5pt;mso-position-horizontal-relative:char;mso-position-vertical-relative:line" coordsize="60356,63" o:gfxdata="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">
                 <v:shape id="Shape 13213" o:spid="_x0000_s1027" style="position:absolute;width:60356;height:0;visibility:visible;mso-wrap-style:square;v-text-anchor:top" coordsize="6035675,0" o:gfxdata="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" path="m6035675,l,e" filled="f" strokecolor="#d5e8f0" strokeweight=".5pt">
                   <v:path arrowok="t" textboxrect="0,0,6035675,0"/>
                 </v:shape>
@@ -1904,6 +3658,9 @@
         <w:spacing w:after="4" w:line="261" w:lineRule="auto"/>
         <w:ind w:right="14" w:hanging="360"/>
         <w:jc w:val="both"/>
+        <w:rPr>
+          <w:lang w:val="fr-FR"/>
+        </w:rPr>
       </w:pPr>
       <w:r>
         <w:rPr>
@@ -1939,32 +3696,40 @@
         </w:rPr>
         <w:t xml:space="preserve"> ? </w:t>
       </w:r>
+      <w:r>
+        <w:rPr>
+          <w:lang w:val="fr-FR"/>
+        </w:rPr>
+        <w:t>Que signifient les options -</w:t>
+      </w:r>
       <w:proofErr w:type="spellStart"/>
       <w:r>
-        <w:t>Que</w:t>
+        <w:rPr>
+          <w:lang w:val="fr-FR"/>
+        </w:rPr>
+        <w:t>shared</w:t>
       </w:r>
       <w:proofErr w:type="spellEnd"/>
       <w:r>
-        <w:t xml:space="preserve"> </w:t>
+        <w:rPr>
+          <w:lang w:val="fr-FR"/>
+        </w:rPr>
+        <w:t xml:space="preserve"> et -</w:t>
       </w:r>
       <w:proofErr w:type="spellStart"/>
       <w:r>
-        <w:t>signifient</w:t>
+        <w:rPr>
+          <w:lang w:val="fr-FR"/>
+        </w:rPr>
+        <w:t>fPIC</w:t>
       </w:r>
       <w:proofErr w:type="spellEnd"/>
       <w:r>
-        <w:t xml:space="preserve"> les options -shared et -</w:t>
-      </w:r>
-      <w:proofErr w:type="spellStart"/>
-      <w:proofErr w:type="gramStart"/>
-      <w:r>
-        <w:t>fPIC</w:t>
-      </w:r>
-      <w:proofErr w:type="spellEnd"/>
-      <w:r>
+        <w:rPr>
+          <w:lang w:val="fr-FR"/>
+        </w:rPr>
         <w:t xml:space="preserve"> ?</w:t>
       </w:r>
-      <w:proofErr w:type="gramEnd"/>
     </w:p>
     <w:p>
       <w:pPr>
@@ -2259,7 +4024,6 @@
         <w:ind w:left="135"/>
       </w:pPr>
       <w:r>
-        <w:lastRenderedPageBreak/>
         <w:t>Étape 7.5 — Checklist de livraison</w:t>
       </w:r>
     </w:p>
@@ -2859,6 +4623,7 @@
                 <w:sz w:val="20"/>
                 <w:lang w:val="fr-FR"/>
               </w:rPr>
+              <w:lastRenderedPageBreak/>
               <w:t>Toutes les issues du service sont en « Terminé »</w:t>
             </w:r>
           </w:p>
@@ -3643,12 +5408,12 @@
     </w:p>
     <w:p/>
     <w:sectPr>
-      <w:headerReference w:type="even" r:id="rId8"/>
-      <w:headerReference w:type="default" r:id="rId9"/>
-      <w:footerReference w:type="even" r:id="rId10"/>
-      <w:footerReference w:type="default" r:id="rId11"/>
-      <w:headerReference w:type="first" r:id="rId12"/>
-      <w:footerReference w:type="first" r:id="rId13"/>
+      <w:headerReference w:type="even" r:id="rId17"/>
+      <w:headerReference w:type="default" r:id="rId18"/>
+      <w:footerReference w:type="even" r:id="rId19"/>
+      <w:footerReference w:type="default" r:id="rId20"/>
+      <w:headerReference w:type="first" r:id="rId21"/>
+      <w:footerReference w:type="first" r:id="rId22"/>
       <w:pgSz w:w="11906" w:h="16838"/>
       <w:pgMar w:top="1200" w:right="1187" w:bottom="1211" w:left="1202" w:header="714" w:footer="708" w:gutter="0"/>
       <w:cols w:space="720"/>
@@ -4246,7 +6011,27 @@
         <w:u w:val="single" w:color="2E75B6"/>
         <w:lang w:val="fr-FR"/>
       </w:rPr>
-      <w:t xml:space="preserve">BUT Informatique 1ère Année  |  </w:t>
+      <w:t xml:space="preserve">BUT Informatique 1ère </w:t>
+    </w:r>
+    <w:proofErr w:type="gramStart"/>
+    <w:r>
+      <w:rPr>
+        <w:color w:val="666666"/>
+        <w:sz w:val="18"/>
+        <w:u w:val="single" w:color="2E75B6"/>
+        <w:lang w:val="fr-FR"/>
+      </w:rPr>
+      <w:t>Année  |</w:t>
+    </w:r>
+    <w:proofErr w:type="gramEnd"/>
+    <w:r>
+      <w:rPr>
+        <w:color w:val="666666"/>
+        <w:sz w:val="18"/>
+        <w:u w:val="single" w:color="2E75B6"/>
+        <w:lang w:val="fr-FR"/>
+      </w:rPr>
+      <w:t xml:space="preserve">  </w:t>
     </w:r>
     <w:r>
       <w:rPr>
@@ -4304,7 +6089,27 @@
         <w:u w:val="single" w:color="2E75B6"/>
         <w:lang w:val="fr-FR"/>
       </w:rPr>
-      <w:t xml:space="preserve">BUT Informatique 1ère Année  |  </w:t>
+      <w:t xml:space="preserve">BUT Informatique 1ère </w:t>
+    </w:r>
+    <w:proofErr w:type="gramStart"/>
+    <w:r>
+      <w:rPr>
+        <w:color w:val="666666"/>
+        <w:sz w:val="18"/>
+        <w:u w:val="single" w:color="2E75B6"/>
+        <w:lang w:val="fr-FR"/>
+      </w:rPr>
+      <w:t>Année  |</w:t>
+    </w:r>
+    <w:proofErr w:type="gramEnd"/>
+    <w:r>
+      <w:rPr>
+        <w:color w:val="666666"/>
+        <w:sz w:val="18"/>
+        <w:u w:val="single" w:color="2E75B6"/>
+        <w:lang w:val="fr-FR"/>
+      </w:rPr>
+      <w:t xml:space="preserve">  </w:t>
     </w:r>
     <w:r>
       <w:rPr>
@@ -7343,6 +9148,18 @@
   </w:num>
   <w:num w:numId="14" w16cid:durableId="1746487470">
     <w:abstractNumId w:val="3"/>
+  </w:num>
+  <w:num w:numId="15" w16cid:durableId="1637297220">
+    <w:abstractNumId w:val="12"/>
+    <w:lvlOverride w:ilvl="0"/>
+    <w:lvlOverride w:ilvl="1"/>
+    <w:lvlOverride w:ilvl="2"/>
+    <w:lvlOverride w:ilvl="3"/>
+    <w:lvlOverride w:ilvl="4"/>
+    <w:lvlOverride w:ilvl="5"/>
+    <w:lvlOverride w:ilvl="6"/>
+    <w:lvlOverride w:ilvl="7"/>
+    <w:lvlOverride w:ilvl="8"/>
   </w:num>
 </w:numbering>
 </file>
@@ -7465,7 +9282,7 @@
     <w:lsdException w:name="HTML Acronym" w:semiHidden="1" w:unhideWhenUsed="1"/>
     <w:lsdException w:name="HTML Address" w:semiHidden="1" w:unhideWhenUsed="1"/>
     <w:lsdException w:name="HTML Cite" w:semiHidden="1" w:unhideWhenUsed="1"/>
-    <w:lsdException w:name="HTML Code" w:semiHidden="1" w:unhideWhenUsed="1"/>
+    <w:lsdException w:name="HTML Code" w:semiHidden="1" w:uiPriority="0" w:unhideWhenUsed="1"/>
     <w:lsdException w:name="HTML Definition" w:semiHidden="1" w:unhideWhenUsed="1"/>
     <w:lsdException w:name="HTML Keyboard" w:semiHidden="1" w:unhideWhenUsed="1"/>
     <w:lsdException w:name="HTML Preformatted" w:semiHidden="1" w:unhideWhenUsed="1"/>
@@ -7989,6 +9806,18 @@
       <w:contextualSpacing/>
     </w:pPr>
   </w:style>
+  <w:style w:type="character" w:styleId="CodeHTML">
+    <w:name w:val="HTML Code"/>
+    <w:basedOn w:val="Policepardfaut"/>
+    <w:semiHidden/>
+    <w:unhideWhenUsed/>
+    <w:rsid w:val="007870BC"/>
+    <w:rPr>
+      <w:rFonts w:ascii="Courier New" w:eastAsia="Times New Roman" w:hAnsi="Courier New" w:cs="Courier New" w:hint="default"/>
+      <w:sz w:val="20"/>
+      <w:szCs w:val="20"/>
+    </w:rPr>
+  </w:style>
 </w:styles>
 </file>
 

</xml_diff>